<commit_message>
Winter plan: Winter Interior Reset $250, New Year Reset $199
Co-Authored-By: Claude Opus 5.5 <noreply@anthropic.com>
Claude-Session: https://claude.ai/code/session_01D87LwuWDcN4nTXwvgo4Xse
</commit_message>
<xml_diff>
--- a/Coastline_Winter_Plan_Nov_Feb.docx
+++ b/Coastline_Winter_Plan_Nov_Feb.docx
@@ -368,7 +368,7 @@
                 <w:sz w:val="20"/>
                 <w:szCs w:val="20"/>
               </w:rPr>
-              <w:t xml:space="preserve">$179 (reg. $200)</w:t>
+              <w:t xml:space="preserve">$250</w:t>
             </w:r>
           </w:p>
         </w:tc>
@@ -440,7 +440,7 @@
                 <w:sz w:val="20"/>
                 <w:szCs w:val="20"/>
               </w:rPr>
-              <w:t xml:space="preserve">$84</w:t>
+              <w:t xml:space="preserve">$155</w:t>
             </w:r>
           </w:p>
         </w:tc>
@@ -952,7 +952,7 @@
                 <w:sz w:val="20"/>
                 <w:szCs w:val="20"/>
               </w:rPr>
-              <w:t xml:space="preserve">$179</w:t>
+              <w:t xml:space="preserve">$199</w:t>
             </w:r>
           </w:p>
         </w:tc>
@@ -1024,7 +1024,7 @@
                 <w:sz w:val="20"/>
                 <w:szCs w:val="20"/>
               </w:rPr>
-              <w:t xml:space="preserve">$84</w:t>
+              <w:t xml:space="preserve">$104</w:t>
             </w:r>
           </w:p>
         </w:tc>
@@ -1460,7 +1460,7 @@
           <w:sz w:val="22"/>
           <w:szCs w:val="22"/>
         </w:rPr>
-        <w:t xml:space="preserve"> Say: "Want the outside done too? It's only $71 more for the full detail." The math: a $179 interior plus $71 makes $250, the full detail price.</w:t>
+        <w:t xml:space="preserve"> On a regular $200 interior, say: "Want the outside done too? It's only $50 more for the full detail." On a Winter Interior Reset, offer the exterior as an add-on.</w:t>
       </w:r>
     </w:p>
     <w:p>
@@ -1475,15 +1475,15 @@
           <w:sz w:val="22"/>
           <w:szCs w:val="22"/>
         </w:rPr>
-        <w:t xml:space="preserve">Why $179 and not cheaper:</w:t>
-      </w:r>
-      <w:r>
-        <w:rPr>
-          <w:rFonts w:ascii="Arial" w:cs="Arial" w:eastAsia="Arial" w:hAnsi="Arial"/>
-          <w:sz w:val="22"/>
-          <w:szCs w:val="22"/>
-        </w:rPr>
-        <w:t xml:space="preserve"> some Athens detailers advertise interiors from about $80. You can't win at that price after paying $70 to the tech and $25 to Rapid Reach, and you don't need to. Win with the things they don't offer:</w:t>
+        <w:t xml:space="preserve">Why $250 and not cheaper:</w:t>
+      </w:r>
+      <w:r>
+        <w:rPr>
+          <w:rFonts w:ascii="Arial" w:cs="Arial" w:eastAsia="Arial" w:hAnsi="Arial"/>
+          <w:sz w:val="22"/>
+          <w:szCs w:val="22"/>
+        </w:rPr>
+        <w:t xml:space="preserve"> some Athens detailers advertise interiors from about $80. You can't win at that price after paying $70 to the tech and $25 to Rapid Reach, and you don't need to. The Winter Interior Reset is the premium package, with mat extraction and odor treatment included. Win with the things they don't offer:</w:t>
       </w:r>
     </w:p>
     <w:p>
@@ -1832,7 +1832,7 @@
           <w:sz w:val="22"/>
           <w:szCs w:val="22"/>
         </w:rPr>
-        <w:t xml:space="preserve"> a GoHighLevel page with the $179 special, before-and-afters, reviews, the guarantee, and a short form or booking calendar. Include a call button.</w:t>
+        <w:t xml:space="preserve"> a GoHighLevel page with the $250 Winter Interior Reset, before-and-afters, reviews, the guarantee, and a short form or booking calendar. Include a call button.</w:t>
       </w:r>
     </w:p>
     <w:p>
@@ -1860,7 +1860,7 @@
           <w:sz w:val="22"/>
           <w:szCs w:val="22"/>
         </w:rPr>
-        <w:t xml:space="preserve"> "Winter Interior Reset $179 | We Come To You | 5-Star Athens Detailer | Book This Week".</w:t>
+        <w:t xml:space="preserve"> "Winter Interior Reset $250 | We Come To You | 5-Star Athens Detailer | Book This Week".</w:t>
       </w:r>
     </w:p>
     <w:p>
@@ -2544,7 +2544,7 @@
           <w:sz w:val="22"/>
           <w:szCs w:val="22"/>
         </w:rPr>
-        <w:t xml:space="preserve">"What $179 gets you in Athens" (fast walk-through of the checklist)</w:t>
+        <w:t xml:space="preserve">"What $250 gets you in Athens" (fast walk-through of the checklist)</w:t>
       </w:r>
     </w:p>
     <w:p>

</xml_diff>

<commit_message>
Winter plan: add profit margin per offer
Co-Authored-By: Claude Opus 5.5 <noreply@anthropic.com>
Claude-Session: https://claude.ai/code/session_01D87LwuWDcN4nTXwvgo4Xse
</commit_message>
<xml_diff>
--- a/Coastline_Winter_Plan_Nov_Feb.docx
+++ b/Coastline_Winter_Plan_Nov_Feb.docx
@@ -140,17 +140,18 @@
         </w:tblBorders>
       </w:tblPr>
       <w:tblGrid>
-        <w:gridCol w:w="3240"/>
-        <w:gridCol w:w="1500"/>
-        <w:gridCol w:w="1500"/>
-        <w:gridCol w:w="1200"/>
-        <w:gridCol w:w="1200"/>
+        <w:gridCol w:w="2640"/>
+        <w:gridCol w:w="1400"/>
+        <w:gridCol w:w="1300"/>
+        <w:gridCol w:w="1100"/>
+        <w:gridCol w:w="1100"/>
+        <w:gridCol w:w="1100"/>
         <w:gridCol w:w="1200"/>
       </w:tblGrid>
       <w:tr>
         <w:tc>
           <w:tcPr>
-            <w:tcW w:type="dxa" w:w="3240"/>
+            <w:tcW w:type="dxa" w:w="2640"/>
             <w:shd w:fill="0E7775" w:color="auto" w:val="clear"/>
             <w:tcMar>
               <w:top w:type="dxa" w:w="60"/>
@@ -175,7 +176,7 @@
         </w:tc>
         <w:tc>
           <w:tcPr>
-            <w:tcW w:type="dxa" w:w="1500"/>
+            <w:tcW w:type="dxa" w:w="1400"/>
             <w:shd w:fill="0E7775" w:color="auto" w:val="clear"/>
             <w:tcMar>
               <w:top w:type="dxa" w:w="60"/>
@@ -200,7 +201,7 @@
         </w:tc>
         <w:tc>
           <w:tcPr>
-            <w:tcW w:type="dxa" w:w="1500"/>
+            <w:tcW w:type="dxa" w:w="1300"/>
             <w:shd w:fill="0E7775" w:color="auto" w:val="clear"/>
             <w:tcMar>
               <w:top w:type="dxa" w:w="60"/>
@@ -225,7 +226,7 @@
         </w:tc>
         <w:tc>
           <w:tcPr>
-            <w:tcW w:type="dxa" w:w="1200"/>
+            <w:tcW w:type="dxa" w:w="1100"/>
             <w:shd w:fill="0E7775" w:color="auto" w:val="clear"/>
             <w:tcMar>
               <w:top w:type="dxa" w:w="60"/>
@@ -250,7 +251,7 @@
         </w:tc>
         <w:tc>
           <w:tcPr>
-            <w:tcW w:type="dxa" w:w="1200"/>
+            <w:tcW w:type="dxa" w:w="1100"/>
             <w:shd w:fill="0E7775" w:color="auto" w:val="clear"/>
             <w:tcMar>
               <w:top w:type="dxa" w:w="60"/>
@@ -275,7 +276,7 @@
         </w:tc>
         <w:tc>
           <w:tcPr>
-            <w:tcW w:type="dxa" w:w="1200"/>
+            <w:tcW w:type="dxa" w:w="1100"/>
             <w:shd w:fill="0E7775" w:color="auto" w:val="clear"/>
             <w:tcMar>
               <w:top w:type="dxa" w:w="60"/>
@@ -298,11 +299,36 @@
             </w:r>
           </w:p>
         </w:tc>
+        <w:tc>
+          <w:tcPr>
+            <w:tcW w:type="dxa" w:w="1200"/>
+            <w:shd w:fill="0E7775" w:color="auto" w:val="clear"/>
+            <w:tcMar>
+              <w:top w:type="dxa" w:w="60"/>
+              <w:left w:type="dxa" w:w="100"/>
+              <w:bottom w:type="dxa" w:w="60"/>
+              <w:right w:type="dxa" w:w="100"/>
+            </w:tcMar>
+          </w:tcPr>
+          <w:p>
+            <w:r>
+              <w:rPr>
+                <w:rFonts w:ascii="Arial" w:cs="Arial" w:eastAsia="Arial" w:hAnsi="Arial"/>
+                <w:b/>
+                <w:bCs/>
+                <w:color w:val="FFFFFF"/>
+                <w:sz w:val="20"/>
+                <w:szCs w:val="20"/>
+              </w:rPr>
+              <w:t xml:space="preserve">Profit margin</w:t>
+            </w:r>
+          </w:p>
+        </w:tc>
       </w:tr>
       <w:tr>
         <w:tc>
           <w:tcPr>
-            <w:tcW w:type="dxa" w:w="3240"/>
+            <w:tcW w:type="dxa" w:w="2640"/>
             <w:tcMar>
               <w:top w:type="dxa" w:w="60"/>
               <w:left w:type="dxa" w:w="100"/>
@@ -326,7 +352,7 @@
         </w:tc>
         <w:tc>
           <w:tcPr>
-            <w:tcW w:type="dxa" w:w="1500"/>
+            <w:tcW w:type="dxa" w:w="1400"/>
             <w:tcMar>
               <w:top w:type="dxa" w:w="60"/>
               <w:left w:type="dxa" w:w="100"/>
@@ -350,7 +376,7 @@
         </w:tc>
         <w:tc>
           <w:tcPr>
-            <w:tcW w:type="dxa" w:w="1500"/>
+            <w:tcW w:type="dxa" w:w="1300"/>
             <w:tcMar>
               <w:top w:type="dxa" w:w="60"/>
               <w:left w:type="dxa" w:w="100"/>
@@ -374,6 +400,78 @@
         </w:tc>
         <w:tc>
           <w:tcPr>
+            <w:tcW w:type="dxa" w:w="1100"/>
+            <w:tcMar>
+              <w:top w:type="dxa" w:w="60"/>
+              <w:left w:type="dxa" w:w="100"/>
+              <w:bottom w:type="dxa" w:w="60"/>
+              <w:right w:type="dxa" w:w="100"/>
+            </w:tcMar>
+          </w:tcPr>
+          <w:p>
+            <w:r>
+              <w:rPr>
+                <w:rFonts w:ascii="Arial" w:cs="Arial" w:eastAsia="Arial" w:hAnsi="Arial"/>
+                <w:b w:val="false"/>
+                <w:bCs w:val="false"/>
+                <w:color w:val="000000"/>
+                <w:sz w:val="20"/>
+                <w:szCs w:val="20"/>
+              </w:rPr>
+              <w:t xml:space="preserve">$70</w:t>
+            </w:r>
+          </w:p>
+        </w:tc>
+        <w:tc>
+          <w:tcPr>
+            <w:tcW w:type="dxa" w:w="1100"/>
+            <w:tcMar>
+              <w:top w:type="dxa" w:w="60"/>
+              <w:left w:type="dxa" w:w="100"/>
+              <w:bottom w:type="dxa" w:w="60"/>
+              <w:right w:type="dxa" w:w="100"/>
+            </w:tcMar>
+          </w:tcPr>
+          <w:p>
+            <w:r>
+              <w:rPr>
+                <w:rFonts w:ascii="Arial" w:cs="Arial" w:eastAsia="Arial" w:hAnsi="Arial"/>
+                <w:b w:val="false"/>
+                <w:bCs w:val="false"/>
+                <w:color w:val="000000"/>
+                <w:sz w:val="20"/>
+                <w:szCs w:val="20"/>
+              </w:rPr>
+              <w:t xml:space="preserve">$25</w:t>
+            </w:r>
+          </w:p>
+        </w:tc>
+        <w:tc>
+          <w:tcPr>
+            <w:tcW w:type="dxa" w:w="1100"/>
+            <w:tcMar>
+              <w:top w:type="dxa" w:w="60"/>
+              <w:left w:type="dxa" w:w="100"/>
+              <w:bottom w:type="dxa" w:w="60"/>
+              <w:right w:type="dxa" w:w="100"/>
+            </w:tcMar>
+          </w:tcPr>
+          <w:p>
+            <w:r>
+              <w:rPr>
+                <w:rFonts w:ascii="Arial" w:cs="Arial" w:eastAsia="Arial" w:hAnsi="Arial"/>
+                <w:b w:val="false"/>
+                <w:bCs w:val="false"/>
+                <w:color w:val="000000"/>
+                <w:sz w:val="20"/>
+                <w:szCs w:val="20"/>
+              </w:rPr>
+              <w:t xml:space="preserve">$155</w:t>
+            </w:r>
+          </w:p>
+        </w:tc>
+        <w:tc>
+          <w:tcPr>
             <w:tcW w:type="dxa" w:w="1200"/>
             <w:tcMar>
               <w:top w:type="dxa" w:w="60"/>
@@ -392,55 +490,7 @@
                 <w:sz w:val="20"/>
                 <w:szCs w:val="20"/>
               </w:rPr>
-              <w:t xml:space="preserve">$70</w:t>
-            </w:r>
-          </w:p>
-        </w:tc>
-        <w:tc>
-          <w:tcPr>
-            <w:tcW w:type="dxa" w:w="1200"/>
-            <w:tcMar>
-              <w:top w:type="dxa" w:w="60"/>
-              <w:left w:type="dxa" w:w="100"/>
-              <w:bottom w:type="dxa" w:w="60"/>
-              <w:right w:type="dxa" w:w="100"/>
-            </w:tcMar>
-          </w:tcPr>
-          <w:p>
-            <w:r>
-              <w:rPr>
-                <w:rFonts w:ascii="Arial" w:cs="Arial" w:eastAsia="Arial" w:hAnsi="Arial"/>
-                <w:b w:val="false"/>
-                <w:bCs w:val="false"/>
-                <w:color w:val="000000"/>
-                <w:sz w:val="20"/>
-                <w:szCs w:val="20"/>
-              </w:rPr>
-              <w:t xml:space="preserve">$25</w:t>
-            </w:r>
-          </w:p>
-        </w:tc>
-        <w:tc>
-          <w:tcPr>
-            <w:tcW w:type="dxa" w:w="1200"/>
-            <w:tcMar>
-              <w:top w:type="dxa" w:w="60"/>
-              <w:left w:type="dxa" w:w="100"/>
-              <w:bottom w:type="dxa" w:w="60"/>
-              <w:right w:type="dxa" w:w="100"/>
-            </w:tcMar>
-          </w:tcPr>
-          <w:p>
-            <w:r>
-              <w:rPr>
-                <w:rFonts w:ascii="Arial" w:cs="Arial" w:eastAsia="Arial" w:hAnsi="Arial"/>
-                <w:b w:val="false"/>
-                <w:bCs w:val="false"/>
-                <w:color w:val="000000"/>
-                <w:sz w:val="20"/>
-                <w:szCs w:val="20"/>
-              </w:rPr>
-              <w:t xml:space="preserve">$155</w:t>
+              <w:t xml:space="preserve">62%</w:t>
             </w:r>
           </w:p>
         </w:tc>
@@ -448,7 +498,7 @@
       <w:tr>
         <w:tc>
           <w:tcPr>
-            <w:tcW w:type="dxa" w:w="3240"/>
+            <w:tcW w:type="dxa" w:w="2640"/>
             <w:tcMar>
               <w:top w:type="dxa" w:w="60"/>
               <w:left w:type="dxa" w:w="100"/>
@@ -472,7 +522,7 @@
         </w:tc>
         <w:tc>
           <w:tcPr>
-            <w:tcW w:type="dxa" w:w="1500"/>
+            <w:tcW w:type="dxa" w:w="1400"/>
             <w:tcMar>
               <w:top w:type="dxa" w:w="60"/>
               <w:left w:type="dxa" w:w="100"/>
@@ -496,7 +546,7 @@
         </w:tc>
         <w:tc>
           <w:tcPr>
-            <w:tcW w:type="dxa" w:w="1500"/>
+            <w:tcW w:type="dxa" w:w="1300"/>
             <w:tcMar>
               <w:top w:type="dxa" w:w="60"/>
               <w:left w:type="dxa" w:w="100"/>
@@ -520,6 +570,78 @@
         </w:tc>
         <w:tc>
           <w:tcPr>
+            <w:tcW w:type="dxa" w:w="1100"/>
+            <w:tcMar>
+              <w:top w:type="dxa" w:w="60"/>
+              <w:left w:type="dxa" w:w="100"/>
+              <w:bottom w:type="dxa" w:w="60"/>
+              <w:right w:type="dxa" w:w="100"/>
+            </w:tcMar>
+          </w:tcPr>
+          <w:p>
+            <w:r>
+              <w:rPr>
+                <w:rFonts w:ascii="Arial" w:cs="Arial" w:eastAsia="Arial" w:hAnsi="Arial"/>
+                <w:b w:val="false"/>
+                <w:bCs w:val="false"/>
+                <w:color w:val="000000"/>
+                <w:sz w:val="20"/>
+                <w:szCs w:val="20"/>
+              </w:rPr>
+              <w:t xml:space="preserve">$140</w:t>
+            </w:r>
+          </w:p>
+        </w:tc>
+        <w:tc>
+          <w:tcPr>
+            <w:tcW w:type="dxa" w:w="1100"/>
+            <w:tcMar>
+              <w:top w:type="dxa" w:w="60"/>
+              <w:left w:type="dxa" w:w="100"/>
+              <w:bottom w:type="dxa" w:w="60"/>
+              <w:right w:type="dxa" w:w="100"/>
+            </w:tcMar>
+          </w:tcPr>
+          <w:p>
+            <w:r>
+              <w:rPr>
+                <w:rFonts w:ascii="Arial" w:cs="Arial" w:eastAsia="Arial" w:hAnsi="Arial"/>
+                <w:b w:val="false"/>
+                <w:bCs w:val="false"/>
+                <w:color w:val="000000"/>
+                <w:sz w:val="20"/>
+                <w:szCs w:val="20"/>
+              </w:rPr>
+              <w:t xml:space="preserve">$50</w:t>
+            </w:r>
+          </w:p>
+        </w:tc>
+        <w:tc>
+          <w:tcPr>
+            <w:tcW w:type="dxa" w:w="1100"/>
+            <w:tcMar>
+              <w:top w:type="dxa" w:w="60"/>
+              <w:left w:type="dxa" w:w="100"/>
+              <w:bottom w:type="dxa" w:w="60"/>
+              <w:right w:type="dxa" w:w="100"/>
+            </w:tcMar>
+          </w:tcPr>
+          <w:p>
+            <w:r>
+              <w:rPr>
+                <w:rFonts w:ascii="Arial" w:cs="Arial" w:eastAsia="Arial" w:hAnsi="Arial"/>
+                <w:b w:val="false"/>
+                <w:bCs w:val="false"/>
+                <w:color w:val="000000"/>
+                <w:sz w:val="20"/>
+                <w:szCs w:val="20"/>
+              </w:rPr>
+              <w:t xml:space="preserve">$150</w:t>
+            </w:r>
+          </w:p>
+        </w:tc>
+        <w:tc>
+          <w:tcPr>
             <w:tcW w:type="dxa" w:w="1200"/>
             <w:tcMar>
               <w:top w:type="dxa" w:w="60"/>
@@ -538,55 +660,7 @@
                 <w:sz w:val="20"/>
                 <w:szCs w:val="20"/>
               </w:rPr>
-              <w:t xml:space="preserve">$140</w:t>
-            </w:r>
-          </w:p>
-        </w:tc>
-        <w:tc>
-          <w:tcPr>
-            <w:tcW w:type="dxa" w:w="1200"/>
-            <w:tcMar>
-              <w:top w:type="dxa" w:w="60"/>
-              <w:left w:type="dxa" w:w="100"/>
-              <w:bottom w:type="dxa" w:w="60"/>
-              <w:right w:type="dxa" w:w="100"/>
-            </w:tcMar>
-          </w:tcPr>
-          <w:p>
-            <w:r>
-              <w:rPr>
-                <w:rFonts w:ascii="Arial" w:cs="Arial" w:eastAsia="Arial" w:hAnsi="Arial"/>
-                <w:b w:val="false"/>
-                <w:bCs w:val="false"/>
-                <w:color w:val="000000"/>
-                <w:sz w:val="20"/>
-                <w:szCs w:val="20"/>
-              </w:rPr>
-              <w:t xml:space="preserve">$50</w:t>
-            </w:r>
-          </w:p>
-        </w:tc>
-        <w:tc>
-          <w:tcPr>
-            <w:tcW w:type="dxa" w:w="1200"/>
-            <w:tcMar>
-              <w:top w:type="dxa" w:w="60"/>
-              <w:left w:type="dxa" w:w="100"/>
-              <w:bottom w:type="dxa" w:w="60"/>
-              <w:right w:type="dxa" w:w="100"/>
-            </w:tcMar>
-          </w:tcPr>
-          <w:p>
-            <w:r>
-              <w:rPr>
-                <w:rFonts w:ascii="Arial" w:cs="Arial" w:eastAsia="Arial" w:hAnsi="Arial"/>
-                <w:b w:val="false"/>
-                <w:bCs w:val="false"/>
-                <w:color w:val="000000"/>
-                <w:sz w:val="20"/>
-                <w:szCs w:val="20"/>
-              </w:rPr>
-              <w:t xml:space="preserve">$150</w:t>
+              <w:t xml:space="preserve">44%</w:t>
             </w:r>
           </w:p>
         </w:tc>
@@ -594,7 +668,7 @@
       <w:tr>
         <w:tc>
           <w:tcPr>
-            <w:tcW w:type="dxa" w:w="3240"/>
+            <w:tcW w:type="dxa" w:w="2640"/>
             <w:tcMar>
               <w:top w:type="dxa" w:w="60"/>
               <w:left w:type="dxa" w:w="100"/>
@@ -618,7 +692,7 @@
         </w:tc>
         <w:tc>
           <w:tcPr>
-            <w:tcW w:type="dxa" w:w="1500"/>
+            <w:tcW w:type="dxa" w:w="1400"/>
             <w:tcMar>
               <w:top w:type="dxa" w:w="60"/>
               <w:left w:type="dxa" w:w="100"/>
@@ -642,7 +716,7 @@
         </w:tc>
         <w:tc>
           <w:tcPr>
-            <w:tcW w:type="dxa" w:w="1500"/>
+            <w:tcW w:type="dxa" w:w="1300"/>
             <w:tcMar>
               <w:top w:type="dxa" w:w="60"/>
               <w:left w:type="dxa" w:w="100"/>
@@ -666,6 +740,78 @@
         </w:tc>
         <w:tc>
           <w:tcPr>
+            <w:tcW w:type="dxa" w:w="1100"/>
+            <w:tcMar>
+              <w:top w:type="dxa" w:w="60"/>
+              <w:left w:type="dxa" w:w="100"/>
+              <w:bottom w:type="dxa" w:w="60"/>
+              <w:right w:type="dxa" w:w="100"/>
+            </w:tcMar>
+          </w:tcPr>
+          <w:p>
+            <w:r>
+              <w:rPr>
+                <w:rFonts w:ascii="Arial" w:cs="Arial" w:eastAsia="Arial" w:hAnsi="Arial"/>
+                <w:b w:val="false"/>
+                <w:bCs w:val="false"/>
+                <w:color w:val="000000"/>
+                <w:sz w:val="20"/>
+                <w:szCs w:val="20"/>
+              </w:rPr>
+              <w:t xml:space="preserve">$85</w:t>
+            </w:r>
+          </w:p>
+        </w:tc>
+        <w:tc>
+          <w:tcPr>
+            <w:tcW w:type="dxa" w:w="1100"/>
+            <w:tcMar>
+              <w:top w:type="dxa" w:w="60"/>
+              <w:left w:type="dxa" w:w="100"/>
+              <w:bottom w:type="dxa" w:w="60"/>
+              <w:right w:type="dxa" w:w="100"/>
+            </w:tcMar>
+          </w:tcPr>
+          <w:p>
+            <w:r>
+              <w:rPr>
+                <w:rFonts w:ascii="Arial" w:cs="Arial" w:eastAsia="Arial" w:hAnsi="Arial"/>
+                <w:b w:val="false"/>
+                <w:bCs w:val="false"/>
+                <w:color w:val="000000"/>
+                <w:sz w:val="20"/>
+                <w:szCs w:val="20"/>
+              </w:rPr>
+              <w:t xml:space="preserve">$25</w:t>
+            </w:r>
+          </w:p>
+        </w:tc>
+        <w:tc>
+          <w:tcPr>
+            <w:tcW w:type="dxa" w:w="1100"/>
+            <w:tcMar>
+              <w:top w:type="dxa" w:w="60"/>
+              <w:left w:type="dxa" w:w="100"/>
+              <w:bottom w:type="dxa" w:w="60"/>
+              <w:right w:type="dxa" w:w="100"/>
+            </w:tcMar>
+          </w:tcPr>
+          <w:p>
+            <w:r>
+              <w:rPr>
+                <w:rFonts w:ascii="Arial" w:cs="Arial" w:eastAsia="Arial" w:hAnsi="Arial"/>
+                <w:b w:val="false"/>
+                <w:bCs w:val="false"/>
+                <w:color w:val="000000"/>
+                <w:sz w:val="20"/>
+                <w:szCs w:val="20"/>
+              </w:rPr>
+              <w:t xml:space="preserve">$140</w:t>
+            </w:r>
+          </w:p>
+        </w:tc>
+        <w:tc>
+          <w:tcPr>
             <w:tcW w:type="dxa" w:w="1200"/>
             <w:tcMar>
               <w:top w:type="dxa" w:w="60"/>
@@ -684,55 +830,7 @@
                 <w:sz w:val="20"/>
                 <w:szCs w:val="20"/>
               </w:rPr>
-              <w:t xml:space="preserve">$85</w:t>
-            </w:r>
-          </w:p>
-        </w:tc>
-        <w:tc>
-          <w:tcPr>
-            <w:tcW w:type="dxa" w:w="1200"/>
-            <w:tcMar>
-              <w:top w:type="dxa" w:w="60"/>
-              <w:left w:type="dxa" w:w="100"/>
-              <w:bottom w:type="dxa" w:w="60"/>
-              <w:right w:type="dxa" w:w="100"/>
-            </w:tcMar>
-          </w:tcPr>
-          <w:p>
-            <w:r>
-              <w:rPr>
-                <w:rFonts w:ascii="Arial" w:cs="Arial" w:eastAsia="Arial" w:hAnsi="Arial"/>
-                <w:b w:val="false"/>
-                <w:bCs w:val="false"/>
-                <w:color w:val="000000"/>
-                <w:sz w:val="20"/>
-                <w:szCs w:val="20"/>
-              </w:rPr>
-              <w:t xml:space="preserve">$25</w:t>
-            </w:r>
-          </w:p>
-        </w:tc>
-        <w:tc>
-          <w:tcPr>
-            <w:tcW w:type="dxa" w:w="1200"/>
-            <w:tcMar>
-              <w:top w:type="dxa" w:w="60"/>
-              <w:left w:type="dxa" w:w="100"/>
-              <w:bottom w:type="dxa" w:w="60"/>
-              <w:right w:type="dxa" w:w="100"/>
-            </w:tcMar>
-          </w:tcPr>
-          <w:p>
-            <w:r>
-              <w:rPr>
-                <w:rFonts w:ascii="Arial" w:cs="Arial" w:eastAsia="Arial" w:hAnsi="Arial"/>
-                <w:b w:val="false"/>
-                <w:bCs w:val="false"/>
-                <w:color w:val="000000"/>
-                <w:sz w:val="20"/>
-                <w:szCs w:val="20"/>
-              </w:rPr>
-              <w:t xml:space="preserve">$140</w:t>
+              <w:t xml:space="preserve">56%</w:t>
             </w:r>
           </w:p>
         </w:tc>
@@ -740,7 +838,7 @@
       <w:tr>
         <w:tc>
           <w:tcPr>
-            <w:tcW w:type="dxa" w:w="3240"/>
+            <w:tcW w:type="dxa" w:w="2640"/>
             <w:tcMar>
               <w:top w:type="dxa" w:w="60"/>
               <w:left w:type="dxa" w:w="100"/>
@@ -764,7 +862,7 @@
         </w:tc>
         <w:tc>
           <w:tcPr>
-            <w:tcW w:type="dxa" w:w="1500"/>
+            <w:tcW w:type="dxa" w:w="1400"/>
             <w:tcMar>
               <w:top w:type="dxa" w:w="60"/>
               <w:left w:type="dxa" w:w="100"/>
@@ -788,7 +886,7 @@
         </w:tc>
         <w:tc>
           <w:tcPr>
-            <w:tcW w:type="dxa" w:w="1500"/>
+            <w:tcW w:type="dxa" w:w="1300"/>
             <w:tcMar>
               <w:top w:type="dxa" w:w="60"/>
               <w:left w:type="dxa" w:w="100"/>
@@ -812,6 +910,78 @@
         </w:tc>
         <w:tc>
           <w:tcPr>
+            <w:tcW w:type="dxa" w:w="1100"/>
+            <w:tcMar>
+              <w:top w:type="dxa" w:w="60"/>
+              <w:left w:type="dxa" w:w="100"/>
+              <w:bottom w:type="dxa" w:w="60"/>
+              <w:right w:type="dxa" w:w="100"/>
+            </w:tcMar>
+          </w:tcPr>
+          <w:p>
+            <w:r>
+              <w:rPr>
+                <w:rFonts w:ascii="Arial" w:cs="Arial" w:eastAsia="Arial" w:hAnsi="Arial"/>
+                <w:b w:val="false"/>
+                <w:bCs w:val="false"/>
+                <w:color w:val="000000"/>
+                <w:sz w:val="20"/>
+                <w:szCs w:val="20"/>
+              </w:rPr>
+              <w:t xml:space="preserve">$70 when redeemed</w:t>
+            </w:r>
+          </w:p>
+        </w:tc>
+        <w:tc>
+          <w:tcPr>
+            <w:tcW w:type="dxa" w:w="1100"/>
+            <w:tcMar>
+              <w:top w:type="dxa" w:w="60"/>
+              <w:left w:type="dxa" w:w="100"/>
+              <w:bottom w:type="dxa" w:w="60"/>
+              <w:right w:type="dxa" w:w="100"/>
+            </w:tcMar>
+          </w:tcPr>
+          <w:p>
+            <w:r>
+              <w:rPr>
+                <w:rFonts w:ascii="Arial" w:cs="Arial" w:eastAsia="Arial" w:hAnsi="Arial"/>
+                <w:b w:val="false"/>
+                <w:bCs w:val="false"/>
+                <w:color w:val="000000"/>
+                <w:sz w:val="20"/>
+                <w:szCs w:val="20"/>
+              </w:rPr>
+              <w:t xml:space="preserve">$25</w:t>
+            </w:r>
+          </w:p>
+        </w:tc>
+        <w:tc>
+          <w:tcPr>
+            <w:tcW w:type="dxa" w:w="1100"/>
+            <w:tcMar>
+              <w:top w:type="dxa" w:w="60"/>
+              <w:left w:type="dxa" w:w="100"/>
+              <w:bottom w:type="dxa" w:w="60"/>
+              <w:right w:type="dxa" w:w="100"/>
+            </w:tcMar>
+          </w:tcPr>
+          <w:p>
+            <w:r>
+              <w:rPr>
+                <w:rFonts w:ascii="Arial" w:cs="Arial" w:eastAsia="Arial" w:hAnsi="Arial"/>
+                <w:b w:val="false"/>
+                <w:bCs w:val="false"/>
+                <w:color w:val="000000"/>
+                <w:sz w:val="20"/>
+                <w:szCs w:val="20"/>
+              </w:rPr>
+              <w:t xml:space="preserve">$84</w:t>
+            </w:r>
+          </w:p>
+        </w:tc>
+        <w:tc>
+          <w:tcPr>
             <w:tcW w:type="dxa" w:w="1200"/>
             <w:tcMar>
               <w:top w:type="dxa" w:w="60"/>
@@ -830,55 +1000,7 @@
                 <w:sz w:val="20"/>
                 <w:szCs w:val="20"/>
               </w:rPr>
-              <w:t xml:space="preserve">$70 when redeemed</w:t>
-            </w:r>
-          </w:p>
-        </w:tc>
-        <w:tc>
-          <w:tcPr>
-            <w:tcW w:type="dxa" w:w="1200"/>
-            <w:tcMar>
-              <w:top w:type="dxa" w:w="60"/>
-              <w:left w:type="dxa" w:w="100"/>
-              <w:bottom w:type="dxa" w:w="60"/>
-              <w:right w:type="dxa" w:w="100"/>
-            </w:tcMar>
-          </w:tcPr>
-          <w:p>
-            <w:r>
-              <w:rPr>
-                <w:rFonts w:ascii="Arial" w:cs="Arial" w:eastAsia="Arial" w:hAnsi="Arial"/>
-                <w:b w:val="false"/>
-                <w:bCs w:val="false"/>
-                <w:color w:val="000000"/>
-                <w:sz w:val="20"/>
-                <w:szCs w:val="20"/>
-              </w:rPr>
-              <w:t xml:space="preserve">$25</w:t>
-            </w:r>
-          </w:p>
-        </w:tc>
-        <w:tc>
-          <w:tcPr>
-            <w:tcW w:type="dxa" w:w="1200"/>
-            <w:tcMar>
-              <w:top w:type="dxa" w:w="60"/>
-              <w:left w:type="dxa" w:w="100"/>
-              <w:bottom w:type="dxa" w:w="60"/>
-              <w:right w:type="dxa" w:w="100"/>
-            </w:tcMar>
-          </w:tcPr>
-          <w:p>
-            <w:r>
-              <w:rPr>
-                <w:rFonts w:ascii="Arial" w:cs="Arial" w:eastAsia="Arial" w:hAnsi="Arial"/>
-                <w:b w:val="false"/>
-                <w:bCs w:val="false"/>
-                <w:color w:val="000000"/>
-                <w:sz w:val="20"/>
-                <w:szCs w:val="20"/>
-              </w:rPr>
-              <w:t xml:space="preserve">$84</w:t>
+              <w:t xml:space="preserve">47%</w:t>
             </w:r>
           </w:p>
         </w:tc>
@@ -886,7 +1008,7 @@
       <w:tr>
         <w:tc>
           <w:tcPr>
-            <w:tcW w:type="dxa" w:w="3240"/>
+            <w:tcW w:type="dxa" w:w="2640"/>
             <w:tcMar>
               <w:top w:type="dxa" w:w="60"/>
               <w:left w:type="dxa" w:w="100"/>
@@ -910,7 +1032,7 @@
         </w:tc>
         <w:tc>
           <w:tcPr>
-            <w:tcW w:type="dxa" w:w="1500"/>
+            <w:tcW w:type="dxa" w:w="1400"/>
             <w:tcMar>
               <w:top w:type="dxa" w:w="60"/>
               <w:left w:type="dxa" w:w="100"/>
@@ -934,7 +1056,7 @@
         </w:tc>
         <w:tc>
           <w:tcPr>
-            <w:tcW w:type="dxa" w:w="1500"/>
+            <w:tcW w:type="dxa" w:w="1300"/>
             <w:tcMar>
               <w:top w:type="dxa" w:w="60"/>
               <w:left w:type="dxa" w:w="100"/>
@@ -958,6 +1080,78 @@
         </w:tc>
         <w:tc>
           <w:tcPr>
+            <w:tcW w:type="dxa" w:w="1100"/>
+            <w:tcMar>
+              <w:top w:type="dxa" w:w="60"/>
+              <w:left w:type="dxa" w:w="100"/>
+              <w:bottom w:type="dxa" w:w="60"/>
+              <w:right w:type="dxa" w:w="100"/>
+            </w:tcMar>
+          </w:tcPr>
+          <w:p>
+            <w:r>
+              <w:rPr>
+                <w:rFonts w:ascii="Arial" w:cs="Arial" w:eastAsia="Arial" w:hAnsi="Arial"/>
+                <w:b w:val="false"/>
+                <w:bCs w:val="false"/>
+                <w:color w:val="000000"/>
+                <w:sz w:val="20"/>
+                <w:szCs w:val="20"/>
+              </w:rPr>
+              <w:t xml:space="preserve">$70</w:t>
+            </w:r>
+          </w:p>
+        </w:tc>
+        <w:tc>
+          <w:tcPr>
+            <w:tcW w:type="dxa" w:w="1100"/>
+            <w:tcMar>
+              <w:top w:type="dxa" w:w="60"/>
+              <w:left w:type="dxa" w:w="100"/>
+              <w:bottom w:type="dxa" w:w="60"/>
+              <w:right w:type="dxa" w:w="100"/>
+            </w:tcMar>
+          </w:tcPr>
+          <w:p>
+            <w:r>
+              <w:rPr>
+                <w:rFonts w:ascii="Arial" w:cs="Arial" w:eastAsia="Arial" w:hAnsi="Arial"/>
+                <w:b w:val="false"/>
+                <w:bCs w:val="false"/>
+                <w:color w:val="000000"/>
+                <w:sz w:val="20"/>
+                <w:szCs w:val="20"/>
+              </w:rPr>
+              <w:t xml:space="preserve">$25</w:t>
+            </w:r>
+          </w:p>
+        </w:tc>
+        <w:tc>
+          <w:tcPr>
+            <w:tcW w:type="dxa" w:w="1100"/>
+            <w:tcMar>
+              <w:top w:type="dxa" w:w="60"/>
+              <w:left w:type="dxa" w:w="100"/>
+              <w:bottom w:type="dxa" w:w="60"/>
+              <w:right w:type="dxa" w:w="100"/>
+            </w:tcMar>
+          </w:tcPr>
+          <w:p>
+            <w:r>
+              <w:rPr>
+                <w:rFonts w:ascii="Arial" w:cs="Arial" w:eastAsia="Arial" w:hAnsi="Arial"/>
+                <w:b w:val="false"/>
+                <w:bCs w:val="false"/>
+                <w:color w:val="000000"/>
+                <w:sz w:val="20"/>
+                <w:szCs w:val="20"/>
+              </w:rPr>
+              <w:t xml:space="preserve">$104</w:t>
+            </w:r>
+          </w:p>
+        </w:tc>
+        <w:tc>
+          <w:tcPr>
             <w:tcW w:type="dxa" w:w="1200"/>
             <w:tcMar>
               <w:top w:type="dxa" w:w="60"/>
@@ -976,55 +1170,7 @@
                 <w:sz w:val="20"/>
                 <w:szCs w:val="20"/>
               </w:rPr>
-              <w:t xml:space="preserve">$70</w:t>
-            </w:r>
-          </w:p>
-        </w:tc>
-        <w:tc>
-          <w:tcPr>
-            <w:tcW w:type="dxa" w:w="1200"/>
-            <w:tcMar>
-              <w:top w:type="dxa" w:w="60"/>
-              <w:left w:type="dxa" w:w="100"/>
-              <w:bottom w:type="dxa" w:w="60"/>
-              <w:right w:type="dxa" w:w="100"/>
-            </w:tcMar>
-          </w:tcPr>
-          <w:p>
-            <w:r>
-              <w:rPr>
-                <w:rFonts w:ascii="Arial" w:cs="Arial" w:eastAsia="Arial" w:hAnsi="Arial"/>
-                <w:b w:val="false"/>
-                <w:bCs w:val="false"/>
-                <w:color w:val="000000"/>
-                <w:sz w:val="20"/>
-                <w:szCs w:val="20"/>
-              </w:rPr>
-              <w:t xml:space="preserve">$25</w:t>
-            </w:r>
-          </w:p>
-        </w:tc>
-        <w:tc>
-          <w:tcPr>
-            <w:tcW w:type="dxa" w:w="1200"/>
-            <w:tcMar>
-              <w:top w:type="dxa" w:w="60"/>
-              <w:left w:type="dxa" w:w="100"/>
-              <w:bottom w:type="dxa" w:w="60"/>
-              <w:right w:type="dxa" w:w="100"/>
-            </w:tcMar>
-          </w:tcPr>
-          <w:p>
-            <w:r>
-              <w:rPr>
-                <w:rFonts w:ascii="Arial" w:cs="Arial" w:eastAsia="Arial" w:hAnsi="Arial"/>
-                <w:b w:val="false"/>
-                <w:bCs w:val="false"/>
-                <w:color w:val="000000"/>
-                <w:sz w:val="20"/>
-                <w:szCs w:val="20"/>
-              </w:rPr>
-              <w:t xml:space="preserve">$104</w:t>
+              <w:t xml:space="preserve">52%</w:t>
             </w:r>
           </w:p>
         </w:tc>
@@ -1032,7 +1178,7 @@
       <w:tr>
         <w:tc>
           <w:tcPr>
-            <w:tcW w:type="dxa" w:w="3240"/>
+            <w:tcW w:type="dxa" w:w="2640"/>
             <w:tcMar>
               <w:top w:type="dxa" w:w="60"/>
               <w:left w:type="dxa" w:w="100"/>
@@ -1056,7 +1202,7 @@
         </w:tc>
         <w:tc>
           <w:tcPr>
-            <w:tcW w:type="dxa" w:w="1500"/>
+            <w:tcW w:type="dxa" w:w="1400"/>
             <w:tcMar>
               <w:top w:type="dxa" w:w="60"/>
               <w:left w:type="dxa" w:w="100"/>
@@ -1080,7 +1226,7 @@
         </w:tc>
         <w:tc>
           <w:tcPr>
-            <w:tcW w:type="dxa" w:w="1500"/>
+            <w:tcW w:type="dxa" w:w="1300"/>
             <w:tcMar>
               <w:top w:type="dxa" w:w="60"/>
               <w:left w:type="dxa" w:w="100"/>
@@ -1104,7 +1250,7 @@
         </w:tc>
         <w:tc>
           <w:tcPr>
-            <w:tcW w:type="dxa" w:w="1200"/>
+            <w:tcW w:type="dxa" w:w="1100"/>
             <w:tcMar>
               <w:top w:type="dxa" w:w="60"/>
               <w:left w:type="dxa" w:w="100"/>
@@ -1128,7 +1274,31 @@
         </w:tc>
         <w:tc>
           <w:tcPr>
-            <w:tcW w:type="dxa" w:w="1200"/>
+            <w:tcW w:type="dxa" w:w="1100"/>
+            <w:tcMar>
+              <w:top w:type="dxa" w:w="60"/>
+              <w:left w:type="dxa" w:w="100"/>
+              <w:bottom w:type="dxa" w:w="60"/>
+              <w:right w:type="dxa" w:w="100"/>
+            </w:tcMar>
+          </w:tcPr>
+          <w:p>
+            <w:r>
+              <w:rPr>
+                <w:rFonts w:ascii="Arial" w:cs="Arial" w:eastAsia="Arial" w:hAnsi="Arial"/>
+                <w:b w:val="false"/>
+                <w:bCs w:val="false"/>
+                <w:color w:val="000000"/>
+                <w:sz w:val="20"/>
+                <w:szCs w:val="20"/>
+              </w:rPr>
+              <w:t xml:space="preserve">—</w:t>
+            </w:r>
+          </w:p>
+        </w:tc>
+        <w:tc>
+          <w:tcPr>
+            <w:tcW w:type="dxa" w:w="1100"/>
             <w:tcMar>
               <w:top w:type="dxa" w:w="60"/>
               <w:left w:type="dxa" w:w="100"/>
@@ -1178,7 +1348,7 @@
       <w:tr>
         <w:tc>
           <w:tcPr>
-            <w:tcW w:type="dxa" w:w="3240"/>
+            <w:tcW w:type="dxa" w:w="2640"/>
             <w:tcMar>
               <w:top w:type="dxa" w:w="60"/>
               <w:left w:type="dxa" w:w="100"/>
@@ -1202,7 +1372,7 @@
         </w:tc>
         <w:tc>
           <w:tcPr>
-            <w:tcW w:type="dxa" w:w="1500"/>
+            <w:tcW w:type="dxa" w:w="1400"/>
             <w:tcMar>
               <w:top w:type="dxa" w:w="60"/>
               <w:left w:type="dxa" w:w="100"/>
@@ -1226,7 +1396,7 @@
         </w:tc>
         <w:tc>
           <w:tcPr>
-            <w:tcW w:type="dxa" w:w="1500"/>
+            <w:tcW w:type="dxa" w:w="1300"/>
             <w:tcMar>
               <w:top w:type="dxa" w:w="60"/>
               <w:left w:type="dxa" w:w="100"/>
@@ -1250,6 +1420,78 @@
         </w:tc>
         <w:tc>
           <w:tcPr>
+            <w:tcW w:type="dxa" w:w="1100"/>
+            <w:tcMar>
+              <w:top w:type="dxa" w:w="60"/>
+              <w:left w:type="dxa" w:w="100"/>
+              <w:bottom w:type="dxa" w:w="60"/>
+              <w:right w:type="dxa" w:w="100"/>
+            </w:tcMar>
+          </w:tcPr>
+          <w:p>
+            <w:r>
+              <w:rPr>
+                <w:rFonts w:ascii="Arial" w:cs="Arial" w:eastAsia="Arial" w:hAnsi="Arial"/>
+                <w:b w:val="false"/>
+                <w:bCs w:val="false"/>
+                <w:color w:val="000000"/>
+                <w:sz w:val="20"/>
+                <w:szCs w:val="20"/>
+              </w:rPr>
+              <w:t xml:space="preserve">$70</w:t>
+            </w:r>
+          </w:p>
+        </w:tc>
+        <w:tc>
+          <w:tcPr>
+            <w:tcW w:type="dxa" w:w="1100"/>
+            <w:tcMar>
+              <w:top w:type="dxa" w:w="60"/>
+              <w:left w:type="dxa" w:w="100"/>
+              <w:bottom w:type="dxa" w:w="60"/>
+              <w:right w:type="dxa" w:w="100"/>
+            </w:tcMar>
+          </w:tcPr>
+          <w:p>
+            <w:r>
+              <w:rPr>
+                <w:rFonts w:ascii="Arial" w:cs="Arial" w:eastAsia="Arial" w:hAnsi="Arial"/>
+                <w:b w:val="false"/>
+                <w:bCs w:val="false"/>
+                <w:color w:val="000000"/>
+                <w:sz w:val="20"/>
+                <w:szCs w:val="20"/>
+              </w:rPr>
+              <w:t xml:space="preserve">$25</w:t>
+            </w:r>
+          </w:p>
+        </w:tc>
+        <w:tc>
+          <w:tcPr>
+            <w:tcW w:type="dxa" w:w="1100"/>
+            <w:tcMar>
+              <w:top w:type="dxa" w:w="60"/>
+              <w:left w:type="dxa" w:w="100"/>
+              <w:bottom w:type="dxa" w:w="60"/>
+              <w:right w:type="dxa" w:w="100"/>
+            </w:tcMar>
+          </w:tcPr>
+          <w:p>
+            <w:r>
+              <w:rPr>
+                <w:rFonts w:ascii="Arial" w:cs="Arial" w:eastAsia="Arial" w:hAnsi="Arial"/>
+                <w:b w:val="false"/>
+                <w:bCs w:val="false"/>
+                <w:color w:val="000000"/>
+                <w:sz w:val="20"/>
+                <w:szCs w:val="20"/>
+              </w:rPr>
+              <w:t xml:space="preserve">$84</w:t>
+            </w:r>
+          </w:p>
+        </w:tc>
+        <w:tc>
+          <w:tcPr>
             <w:tcW w:type="dxa" w:w="1200"/>
             <w:tcMar>
               <w:top w:type="dxa" w:w="60"/>
@@ -1268,55 +1510,7 @@
                 <w:sz w:val="20"/>
                 <w:szCs w:val="20"/>
               </w:rPr>
-              <w:t xml:space="preserve">$70</w:t>
-            </w:r>
-          </w:p>
-        </w:tc>
-        <w:tc>
-          <w:tcPr>
-            <w:tcW w:type="dxa" w:w="1200"/>
-            <w:tcMar>
-              <w:top w:type="dxa" w:w="60"/>
-              <w:left w:type="dxa" w:w="100"/>
-              <w:bottom w:type="dxa" w:w="60"/>
-              <w:right w:type="dxa" w:w="100"/>
-            </w:tcMar>
-          </w:tcPr>
-          <w:p>
-            <w:r>
-              <w:rPr>
-                <w:rFonts w:ascii="Arial" w:cs="Arial" w:eastAsia="Arial" w:hAnsi="Arial"/>
-                <w:b w:val="false"/>
-                <w:bCs w:val="false"/>
-                <w:color w:val="000000"/>
-                <w:sz w:val="20"/>
-                <w:szCs w:val="20"/>
-              </w:rPr>
-              <w:t xml:space="preserve">$25</w:t>
-            </w:r>
-          </w:p>
-        </w:tc>
-        <w:tc>
-          <w:tcPr>
-            <w:tcW w:type="dxa" w:w="1200"/>
-            <w:tcMar>
-              <w:top w:type="dxa" w:w="60"/>
-              <w:left w:type="dxa" w:w="100"/>
-              <w:bottom w:type="dxa" w:w="60"/>
-              <w:right w:type="dxa" w:w="100"/>
-            </w:tcMar>
-          </w:tcPr>
-          <w:p>
-            <w:r>
-              <w:rPr>
-                <w:rFonts w:ascii="Arial" w:cs="Arial" w:eastAsia="Arial" w:hAnsi="Arial"/>
-                <w:b w:val="false"/>
-                <w:bCs w:val="false"/>
-                <w:color w:val="000000"/>
-                <w:sz w:val="20"/>
-                <w:szCs w:val="20"/>
-              </w:rPr>
-              <w:t xml:space="preserve">$84</w:t>
+              <w:t xml:space="preserve">47%</w:t>
             </w:r>
           </w:p>
         </w:tc>
@@ -1326,6 +1520,19 @@
       <w:pPr>
         <w:spacing w:after="120"/>
       </w:pPr>
+    </w:p>
+    <w:p>
+      <w:pPr>
+        <w:spacing w:after="120"/>
+      </w:pPr>
+      <w:r>
+        <w:rPr>
+          <w:rFonts w:ascii="Arial" w:cs="Arial" w:eastAsia="Arial" w:hAnsi="Arial"/>
+          <w:sz w:val="22"/>
+          <w:szCs w:val="22"/>
+        </w:rPr>
+        <w:t xml:space="preserve">Profit margin = what you keep ÷ price, before supplies, ads and software. The Winter Interior Reset has the best margin of any offer at 62%, compared with 52% on a regular $200 interior, so push it hardest.</w:t>
+      </w:r>
     </w:p>
     <w:p>
       <w:pPr>

</xml_diff>